<commit_message>
Update PRD for the analog mic and pulse-jack capture kinds
Co-Authored-By: Claude Sonnet 5 <noreply@anthropic.com>
</commit_message>
<xml_diff>
--- a/docs/prd/Kai_PRD_v2.3.docx
+++ b/docs/prd/Kai_PRD_v2.3.docx
@@ -32297,7 +32297,7 @@
           <w:szCs w:val="22"/>
           <w:rtl w:val="0"/>
         </w:rPr>
-        <w:t xml:space="preserve">The following photos document Kai's physical build and the DEVCON 17 launch event (June 2026), captured by Cohort 4 AI Engineering Interns.</w:t>
+        <w:t>The following photos document Kai's physical build across the DEVCON 17 launch event (June 2026) and the Mindanao showcase (August 2026), captured by Cohort 4 AI Engineering Interns.</w:t>
       </w:r>
       <w:r>
         <w:rPr>
@@ -32307,38 +32307,25 @@
     </w:p>
     <w:p>
       <w:pPr>
-        <w:spacing w:after="0" w:before="80" w:lineRule="auto"/>
-        <w:rPr/>
+        <w:jc w:val="center"/>
       </w:pPr>
       <w:r>
-        <w:rPr>
-          <w:rtl w:val="0"/>
-        </w:rPr>
-      </w:r>
-    </w:p>
-    <w:p>
-      <w:pPr>
-        <w:spacing w:after="80" w:before="40" w:lineRule="auto"/>
-        <w:jc w:val="center"/>
-        <w:rPr/>
-      </w:pPr>
-      <w:r>
-        <w:rPr/>
         <w:drawing>
-          <wp:inline distB="0" distT="0" distL="0" distR="0">
-            <wp:extent cx="3390900" cy="4514850"/>
-            <wp:effectExtent b="0" l="0" r="0" t="0"/>
-            <wp:docPr id="3" name="image3.png"/>
+          <wp:inline>
+            <wp:extent cx="4572000" cy="3429000"/>
+            <wp:docPr id="2" name="Picture 2"/>
+            <wp:cNvGraphicFramePr>
+              <a:graphicFrameLocks noChangeAspect="1"/>
+            </wp:cNvGraphicFramePr>
             <a:graphic>
               <a:graphicData uri="http://schemas.openxmlformats.org/drawingml/2006/picture">
                 <pic:pic>
                   <pic:nvPicPr>
-                    <pic:cNvPr id="0" name="image3.png"/>
-                    <pic:cNvPicPr preferRelativeResize="0"/>
+                    <pic:cNvPr id="0" name="kai-image-01.jpg"/>
+                    <pic:cNvPicPr/>
                   </pic:nvPicPr>
                   <pic:blipFill>
-                    <a:blip r:embed="rId8"/>
-                    <a:srcRect b="0" l="0" r="0" t="0"/>
+                    <a:blip r:embed="rId12"/>
                     <a:stretch>
                       <a:fillRect/>
                     </a:stretch>
@@ -32346,10 +32333,9 @@
                   <pic:spPr>
                     <a:xfrm>
                       <a:off x="0" y="0"/>
-                      <a:ext cx="3390900" cy="4514850"/>
+                      <a:ext cx="4572000" cy="3429000"/>
                     </a:xfrm>
                     <a:prstGeom prst="rect"/>
-                    <a:ln/>
                   </pic:spPr>
                 </pic:pic>
               </a:graphicData>
@@ -32357,46 +32343,41 @@
           </wp:inline>
         </w:drawing>
       </w:r>
-      <w:r>
-        <w:rPr>
-          <w:rtl w:val="0"/>
-        </w:rPr>
-      </w:r>
     </w:p>
     <w:p>
       <w:pPr>
-        <w:spacing w:after="0" w:before="80" w:lineRule="auto"/>
-        <w:rPr/>
+        <w:jc w:val="center"/>
       </w:pPr>
       <w:r>
         <w:rPr>
-          <w:rtl w:val="0"/>
+          <w:i/>
+          <w:sz w:val="18"/>
         </w:rPr>
+        <w:t>DEVCON attendees and officials viewing the Kai booth setup at the Mindanao showcase, August 2026.</w:t>
       </w:r>
     </w:p>
+    <w:p/>
     <w:p>
       <w:pPr>
-        <w:spacing w:after="80" w:before="40" w:lineRule="auto"/>
         <w:jc w:val="center"/>
-        <w:rPr/>
       </w:pPr>
       <w:r>
-        <w:rPr/>
         <w:drawing>
-          <wp:inline distB="0" distT="0" distL="0" distR="0">
-            <wp:extent cx="5943600" cy="4457700"/>
-            <wp:effectExtent b="0" l="0" r="0" t="0"/>
-            <wp:docPr id="2" name="image1.png"/>
+          <wp:inline>
+            <wp:extent cx="4572000" cy="3429000"/>
+            <wp:docPr id="3" name="Picture 3"/>
+            <wp:cNvGraphicFramePr>
+              <a:graphicFrameLocks noChangeAspect="1"/>
+            </wp:cNvGraphicFramePr>
             <a:graphic>
               <a:graphicData uri="http://schemas.openxmlformats.org/drawingml/2006/picture">
                 <pic:pic>
                   <pic:nvPicPr>
-                    <pic:cNvPr id="0" name="image1.png"/>
-                    <pic:cNvPicPr preferRelativeResize="0"/>
+                    <pic:cNvPr id="0" name="kai-image-02.jpg"/>
+                    <pic:cNvPicPr/>
                   </pic:nvPicPr>
                   <pic:blipFill>
-                    <a:blip r:embed="rId9"/>
-                    <a:srcRect b="0" l="0" r="0" t="0"/>
+                    <a:blip r:embed="rId13"/>
                     <a:stretch>
                       <a:fillRect/>
                     </a:stretch>
@@ -32404,10 +32385,9 @@
                   <pic:spPr>
                     <a:xfrm>
                       <a:off x="0" y="0"/>
-                      <a:ext cx="5943600" cy="4457700"/>
+                      <a:ext cx="4572000" cy="3429000"/>
                     </a:xfrm>
                     <a:prstGeom prst="rect"/>
-                    <a:ln/>
                   </pic:spPr>
                 </pic:pic>
               </a:graphicData>
@@ -32415,23 +32395,332 @@
           </wp:inline>
         </w:drawing>
       </w:r>
+    </w:p>
+    <w:p>
+      <w:pPr>
+        <w:jc w:val="center"/>
+      </w:pPr>
       <w:r>
         <w:rPr>
-          <w:rtl w:val="0"/>
+          <w:i/>
+          <w:sz w:val="18"/>
         </w:rPr>
+        <w:t>Visitors leaning in to see Kai's face-tracking demo running live on the booth table.</w:t>
+      </w:r>
+    </w:p>
+    <w:p/>
+    <w:p>
+      <w:pPr>
+        <w:jc w:val="center"/>
+      </w:pPr>
+      <w:r>
+        <w:drawing>
+          <wp:inline>
+            <wp:extent cx="4572000" cy="6096000"/>
+            <wp:docPr id="4" name="Picture 4"/>
+            <wp:cNvGraphicFramePr>
+              <a:graphicFrameLocks noChangeAspect="1"/>
+            </wp:cNvGraphicFramePr>
+            <a:graphic>
+              <a:graphicData uri="http://schemas.openxmlformats.org/drawingml/2006/picture">
+                <pic:pic>
+                  <pic:nvPicPr>
+                    <pic:cNvPr id="0" name="kai-image-03.jpg"/>
+                    <pic:cNvPicPr/>
+                  </pic:nvPicPr>
+                  <pic:blipFill>
+                    <a:blip r:embed="rId14"/>
+                    <a:stretch>
+                      <a:fillRect/>
+                    </a:stretch>
+                  </pic:blipFill>
+                  <pic:spPr>
+                    <a:xfrm>
+                      <a:off x="0" y="0"/>
+                      <a:ext cx="4572000" cy="6096000"/>
+                    </a:xfrm>
+                    <a:prstGeom prst="rect"/>
+                  </pic:spPr>
+                </pic:pic>
+              </a:graphicData>
+            </a:graphic>
+          </wp:inline>
+        </w:drawing>
       </w:r>
     </w:p>
     <w:p>
       <w:pPr>
-        <w:spacing w:after="0" w:before="160" w:lineRule="auto"/>
-        <w:rPr/>
+        <w:jc w:val="center"/>
       </w:pPr>
       <w:r>
         <w:rPr>
-          <w:rtl w:val="0"/>
+          <w:i/>
+          <w:sz w:val="18"/>
         </w:rPr>
+        <w:t>Jetson Orin Nano and Arduino Uno on the bench, wired for the USB serial servo link.</w:t>
       </w:r>
     </w:p>
+    <w:p/>
+    <w:p>
+      <w:pPr>
+        <w:jc w:val="center"/>
+      </w:pPr>
+      <w:r>
+        <w:drawing>
+          <wp:inline>
+            <wp:extent cx="4572000" cy="7767813"/>
+            <wp:docPr id="5" name="Picture 5"/>
+            <wp:cNvGraphicFramePr>
+              <a:graphicFrameLocks noChangeAspect="1"/>
+            </wp:cNvGraphicFramePr>
+            <a:graphic>
+              <a:graphicData uri="http://schemas.openxmlformats.org/drawingml/2006/picture">
+                <pic:pic>
+                  <pic:nvPicPr>
+                    <pic:cNvPr id="0" name="kai-image-04.jpg"/>
+                    <pic:cNvPicPr/>
+                  </pic:nvPicPr>
+                  <pic:blipFill>
+                    <a:blip r:embed="rId15"/>
+                    <a:stretch>
+                      <a:fillRect/>
+                    </a:stretch>
+                  </pic:blipFill>
+                  <pic:spPr>
+                    <a:xfrm>
+                      <a:off x="0" y="0"/>
+                      <a:ext cx="4572000" cy="7767813"/>
+                    </a:xfrm>
+                    <a:prstGeom prst="rect"/>
+                  </pic:spPr>
+                </pic:pic>
+              </a:graphicData>
+            </a:graphic>
+          </wp:inline>
+        </w:drawing>
+      </w:r>
+    </w:p>
+    <w:p>
+      <w:pPr>
+        <w:jc w:val="center"/>
+      </w:pPr>
+      <w:r>
+        <w:rPr>
+          <w:i/>
+          <w:sz w:val="18"/>
+        </w:rPr>
+        <w:t>Kai's cardboard head with pipe-cleaner glasses and googly eyes, connected for a bench test.</w:t>
+      </w:r>
+    </w:p>
+    <w:p/>
+    <w:p>
+      <w:pPr>
+        <w:jc w:val="center"/>
+      </w:pPr>
+      <w:r>
+        <w:drawing>
+          <wp:inline>
+            <wp:extent cx="4572000" cy="6096000"/>
+            <wp:docPr id="6" name="Picture 6"/>
+            <wp:cNvGraphicFramePr>
+              <a:graphicFrameLocks noChangeAspect="1"/>
+            </wp:cNvGraphicFramePr>
+            <a:graphic>
+              <a:graphicData uri="http://schemas.openxmlformats.org/drawingml/2006/picture">
+                <pic:pic>
+                  <pic:nvPicPr>
+                    <pic:cNvPr id="0" name="kai-image-05.jpg"/>
+                    <pic:cNvPicPr/>
+                  </pic:nvPicPr>
+                  <pic:blipFill>
+                    <a:blip r:embed="rId16"/>
+                    <a:stretch>
+                      <a:fillRect/>
+                    </a:stretch>
+                  </pic:blipFill>
+                  <pic:spPr>
+                    <a:xfrm>
+                      <a:off x="0" y="0"/>
+                      <a:ext cx="4572000" cy="6096000"/>
+                    </a:xfrm>
+                    <a:prstGeom prst="rect"/>
+                  </pic:spPr>
+                </pic:pic>
+              </a:graphicData>
+            </a:graphic>
+          </wp:inline>
+        </w:drawing>
+      </w:r>
+    </w:p>
+    <w:p>
+      <w:pPr>
+        <w:jc w:val="center"/>
+      </w:pPr>
+      <w:r>
+        <w:rPr>
+          <w:i/>
+          <w:sz w:val="18"/>
+        </w:rPr>
+        <w:t>INMP441 microphone wiring on a breadboard beside the Jetson during hardware bring-up.</w:t>
+      </w:r>
+    </w:p>
+    <w:p/>
+    <w:p>
+      <w:pPr>
+        <w:jc w:val="center"/>
+      </w:pPr>
+      <w:r>
+        <w:drawing>
+          <wp:inline>
+            <wp:extent cx="4572000" cy="6096000"/>
+            <wp:docPr id="7" name="Picture 7"/>
+            <wp:cNvGraphicFramePr>
+              <a:graphicFrameLocks noChangeAspect="1"/>
+            </wp:cNvGraphicFramePr>
+            <a:graphic>
+              <a:graphicData uri="http://schemas.openxmlformats.org/drawingml/2006/picture">
+                <pic:pic>
+                  <pic:nvPicPr>
+                    <pic:cNvPr id="0" name="kai-image-06.jpg"/>
+                    <pic:cNvPicPr/>
+                  </pic:nvPicPr>
+                  <pic:blipFill>
+                    <a:blip r:embed="rId17"/>
+                    <a:stretch>
+                      <a:fillRect/>
+                    </a:stretch>
+                  </pic:blipFill>
+                  <pic:spPr>
+                    <a:xfrm>
+                      <a:off x="0" y="0"/>
+                      <a:ext cx="4572000" cy="6096000"/>
+                    </a:xfrm>
+                    <a:prstGeom prst="rect"/>
+                  </pic:spPr>
+                </pic:pic>
+              </a:graphicData>
+            </a:graphic>
+          </wp:inline>
+        </w:drawing>
+      </w:r>
+    </w:p>
+    <w:p>
+      <w:pPr>
+        <w:jc w:val="center"/>
+      </w:pPr>
+      <w:r>
+        <w:rPr>
+          <w:i/>
+          <w:sz w:val="18"/>
+        </w:rPr>
+        <w:t>The assembled head and body, with felt trim, resting on the Jetson Orin Nano box.</w:t>
+      </w:r>
+    </w:p>
+    <w:p/>
+    <w:p>
+      <w:pPr>
+        <w:jc w:val="center"/>
+      </w:pPr>
+      <w:r>
+        <w:drawing>
+          <wp:inline>
+            <wp:extent cx="4572000" cy="6096000"/>
+            <wp:docPr id="8" name="Picture 8"/>
+            <wp:cNvGraphicFramePr>
+              <a:graphicFrameLocks noChangeAspect="1"/>
+            </wp:cNvGraphicFramePr>
+            <a:graphic>
+              <a:graphicData uri="http://schemas.openxmlformats.org/drawingml/2006/picture">
+                <pic:pic>
+                  <pic:nvPicPr>
+                    <pic:cNvPr id="0" name="kai-image-07.jpg"/>
+                    <pic:cNvPicPr/>
+                  </pic:nvPicPr>
+                  <pic:blipFill>
+                    <a:blip r:embed="rId18"/>
+                    <a:stretch>
+                      <a:fillRect/>
+                    </a:stretch>
+                  </pic:blipFill>
+                  <pic:spPr>
+                    <a:xfrm>
+                      <a:off x="0" y="0"/>
+                      <a:ext cx="4572000" cy="6096000"/>
+                    </a:xfrm>
+                    <a:prstGeom prst="rect"/>
+                  </pic:spPr>
+                </pic:pic>
+              </a:graphicData>
+            </a:graphic>
+          </wp:inline>
+        </w:drawing>
+      </w:r>
+    </w:p>
+    <w:p>
+      <w:pPr>
+        <w:jc w:val="center"/>
+      </w:pPr>
+      <w:r>
+        <w:rPr>
+          <w:i/>
+          <w:sz w:val="18"/>
+        </w:rPr>
+        <w:t>Front view of the finished cardboard chassis on the Jetson Orin Nano box.</w:t>
+      </w:r>
+    </w:p>
+    <w:p/>
+    <w:p>
+      <w:pPr>
+        <w:jc w:val="center"/>
+      </w:pPr>
+      <w:r>
+        <w:drawing>
+          <wp:inline>
+            <wp:extent cx="4572000" cy="7647572"/>
+            <wp:docPr id="9" name="Picture 9"/>
+            <wp:cNvGraphicFramePr>
+              <a:graphicFrameLocks noChangeAspect="1"/>
+            </wp:cNvGraphicFramePr>
+            <a:graphic>
+              <a:graphicData uri="http://schemas.openxmlformats.org/drawingml/2006/picture">
+                <pic:pic>
+                  <pic:nvPicPr>
+                    <pic:cNvPr id="0" name="kai-image-08.jpg"/>
+                    <pic:cNvPicPr/>
+                  </pic:nvPicPr>
+                  <pic:blipFill>
+                    <a:blip r:embed="rId19"/>
+                    <a:stretch>
+                      <a:fillRect/>
+                    </a:stretch>
+                  </pic:blipFill>
+                  <pic:spPr>
+                    <a:xfrm>
+                      <a:off x="0" y="0"/>
+                      <a:ext cx="4572000" cy="7647572"/>
+                    </a:xfrm>
+                    <a:prstGeom prst="rect"/>
+                  </pic:spPr>
+                </pic:pic>
+              </a:graphicData>
+            </a:graphic>
+          </wp:inline>
+        </w:drawing>
+      </w:r>
+    </w:p>
+    <w:p>
+      <w:pPr>
+        <w:jc w:val="center"/>
+      </w:pPr>
+      <w:r>
+        <w:rPr>
+          <w:i/>
+          <w:sz w:val="18"/>
+        </w:rPr>
+        <w:t>An earlier prototype head with the camera mounted in the lower jaw box.</w:t>
+      </w:r>
+    </w:p>
+    <w:p/>
     <w:p>
       <w:pPr>
         <w:pStyle w:val="Heading1"/>

</xml_diff>